<commit_message>
feat: drive the live desktop session from the Edge side panel (streaming, stop, Codex sync)
</commit_message>
<xml_diff>
--- a/安装教程.docx
+++ b/安装教程.docx
@@ -98,7 +98,7 @@
           <w:color w:val="6B7490"/>
           <w:sz w:val="21"/>
         </w:rPr>
-        <w:t>版本 1.3.0    |    2026 年 10 月</w:t>
+        <w:t>版本 1.4.0    |    2026 年 10 月</w:t>
       </w:r>
     </w:p>
     <w:p>
@@ -570,7 +570,7 @@
                 <w:b w:val="0"/>
                 <w:sz w:val="19"/>
               </w:rPr>
-              <w:t>dsh-edge-companion-1.3.0.zip</w:t>
+              <w:t>dsh-edge-companion-1.4.0.zip</w:t>
             </w:r>
           </w:p>
         </w:tc>
@@ -613,7 +613,7 @@
           <w:color w:val="1F2A44"/>
           <w:sz w:val="25"/>
         </w:rPr>
-        <w:t>1.2  三个部件分别做什么</w:t>
+        <w:t>1.2  四个部件分别做什么</w:t>
       </w:r>
     </w:p>
     <w:tbl>
@@ -884,6 +884,68 @@
           </w:p>
         </w:tc>
       </w:tr>
+      <w:tr>
+        <w:trPr>
+          <w:cantSplit/>
+        </w:trPr>
+        <w:tc>
+          <w:tcPr>
+            <w:tcW w:type="dxa" w:w="1928"/>
+          </w:tcPr>
+          <w:p>
+            <w:pPr>
+              <w:spacing w:after="40" w:before="20"/>
+            </w:pPr>
+            <w:r/>
+            <w:r>
+              <w:rPr>
+                <w:rFonts w:ascii="微软雅黑" w:hAnsi="微软雅黑" w:eastAsia="微软雅黑"/>
+                <w:b w:val="0"/>
+                <w:sz w:val="19"/>
+              </w:rPr>
+              <w:t>dsh-agent-host/</w:t>
+            </w:r>
+          </w:p>
+        </w:tc>
+        <w:tc>
+          <w:tcPr>
+            <w:tcW w:type="dxa" w:w="5669"/>
+          </w:tcPr>
+          <w:p>
+            <w:pPr>
+              <w:spacing w:after="40" w:before="20"/>
+            </w:pPr>
+            <w:r/>
+            <w:r>
+              <w:rPr>
+                <w:rFonts w:ascii="微软雅黑" w:hAnsi="微软雅黑" w:eastAsia="微软雅黑"/>
+                <w:b w:val="0"/>
+                <w:sz w:val="19"/>
+              </w:rPr>
+              <w:t>DSH 插件：把侧边栏接到客户端同一会话（实时/停止/Codex）</w:t>
+            </w:r>
+          </w:p>
+        </w:tc>
+        <w:tc>
+          <w:tcPr>
+            <w:tcW w:type="dxa" w:w="2041"/>
+          </w:tcPr>
+          <w:p>
+            <w:pPr>
+              <w:spacing w:after="40" w:before="20"/>
+            </w:pPr>
+            <w:r/>
+            <w:r>
+              <w:rPr>
+                <w:rFonts w:ascii="微软雅黑" w:hAnsi="微软雅黑" w:eastAsia="微软雅黑"/>
+                <w:b w:val="0"/>
+                <w:sz w:val="19"/>
+              </w:rPr>
+              <w:t>在 DSH 中安装一次</w:t>
+            </w:r>
+          </w:p>
+        </w:tc>
+      </w:tr>
     </w:tbl>
     <w:p>
       <w:pPr>
@@ -1025,7 +1087,7 @@
           <w:color w:val="2A3352"/>
           <w:sz w:val="21"/>
         </w:rPr>
-        <w:t>把 dsh-edge-companion-1.3.0.zip 解压到任意目录（路径可以包含空格或中文）。</w:t>
+        <w:t>把 dsh-edge-companion-1.4.0.zip 解压到任意目录（路径可以包含空格或中文）。</w:t>
       </w:r>
     </w:p>
     <w:p>
@@ -1049,7 +1111,7 @@
           <w:color w:val="2A3352"/>
           <w:sz w:val="21"/>
         </w:rPr>
-        <w:t>建议不要放在 C:\ 根目录；解压后应能看到 extension、bridge、dsh-plugin 等文件夹。</w:t>
+        <w:t>建议不要放在 C:\ 根目录；解压后应能看到 extension、bridge、dsh-plugin、dsh-agent-host 等文件夹。</w:t>
       </w:r>
     </w:p>
     <w:p>
@@ -1161,7 +1223,7 @@
           <w:color w:val="2A3352"/>
           <w:sz w:val="21"/>
         </w:rPr>
-        <w:t>看到 DSH Edge Bridge 1.2.0（蓝发鲸鱼少女图标）即安装成功。</w:t>
+        <w:t>看到 DSH Edge Bridge 1.3.0（蓝发鲸鱼少女图标）即安装成功。</w:t>
       </w:r>
     </w:p>
     <w:p>
@@ -1191,7 +1253,7 @@
           <w:color w:val="1F2A44"/>
           <w:sz w:val="25"/>
         </w:rPr>
-        <w:t>2.3  安装 DSH 插件（推荐，必做）</w:t>
+        <w:t>2.3  安装两个 DSH 插件（推荐，必做）</w:t>
       </w:r>
     </w:p>
     <w:p>
@@ -1205,7 +1267,7 @@
           <w:color w:val="1F2A44"/>
           <w:sz w:val="21"/>
         </w:rPr>
-        <w:t>装好插件后，只要 DeepSeek Harness 开着，桥接就自动在后台运行——不需要点按钮、不需要 .cmd、不需要开机自启。</w:t>
+        <w:t>两个插件分工：dsh-plugin 负责启动桥接；dsh-agent-host 负责把侧边栏接到客户端同一个 Agent，实现实时流、停止按钮和 Codex 状态同步。</w:t>
       </w:r>
     </w:p>
     <w:p>
@@ -1301,7 +1363,31 @@
           <w:color w:val="2A3352"/>
           <w:sz w:val="21"/>
         </w:rPr>
-        <w:t>点击 Install（以 link: 方式安装，不联网、不下载）；如果提示需要重启，重启一次 DSH。</w:t>
+        <w:t>点 Install；再安装第二个文件夹 dsh-agent-host（例如 D:\tools\dsh-edge-companion\dsh-agent-host）。</w:t>
+      </w:r>
+    </w:p>
+    <w:p>
+      <w:pPr>
+        <w:spacing w:after="80" w:line="336" w:lineRule="auto"/>
+        <w:ind w:left="510" w:hanging="312"/>
+      </w:pPr>
+      <w:r>
+        <w:rPr>
+          <w:rFonts w:ascii="微软雅黑" w:hAnsi="微软雅黑" w:eastAsia="微软雅黑"/>
+          <w:b/>
+          <w:color w:val="4D6BFE"/>
+          <w:sz w:val="21"/>
+        </w:rPr>
+        <w:t xml:space="preserve">•  </w:t>
+      </w:r>
+      <w:r>
+        <w:rPr>
+          <w:rFonts w:ascii="微软雅黑" w:hAnsi="微软雅黑" w:eastAsia="微软雅黑"/>
+          <w:b w:val="0"/>
+          <w:color w:val="2A3352"/>
+          <w:sz w:val="21"/>
+        </w:rPr>
+        <w:t>两次都以 link: 方式安装，不联网、不下载；如果提示需要重启，重启一次 DSH。</w:t>
       </w:r>
     </w:p>
     <w:tbl>
@@ -1342,7 +1428,7 @@
                 <w:color w:val="2A3A6A"/>
                 <w:sz w:val="19"/>
               </w:rPr>
-              <w:t>如何取路径：在资源管理器里进入 dsh-edge-companion，按住 Shift 右键点击 dsh-plugin 文件夹，选择「复制文件地址」，粘贴到输入框即可（去掉两侧引号）。</w:t>
+              <w:t>如何取路径：在资源管理器里进入 dsh-edge-companion，按住 Shift 右键点击对应文件夹，选择「复制文件地址」，粘贴到输入框即可（去掉两侧引号）。</w:t>
             </w:r>
           </w:p>
         </w:tc>
@@ -1428,7 +1514,7 @@
           <w:color w:val="2A3352"/>
           <w:sz w:val="21"/>
         </w:rPr>
-        <w:t>命令行：运行 bin\edge.cmd status，看到 "extension": { "connected": true }。</w:t>
+        <w:t>命令行：运行 bin\edge.cmd status，看到 "host": { "connected": true } 且 "extension": { "connected": true }。</w:t>
       </w:r>
     </w:p>
     <w:p>
@@ -1587,7 +1673,7 @@
           <w:color w:val="1F2A44"/>
           <w:sz w:val="21"/>
         </w:rPr>
-        <w:t>侧边栏是真实 DSH 会话的镜像：你在里面发指令，桥接会启动一次无头 DSH 去操作浏览器，思考过程、工具调用、回复与 token 用量都会实时出现在侧边栏。</w:t>
+        <w:t>侧边栏不是另开一个聊天框：装好 dsh-agent-host 后，它直接驱动客户端当前会话——你的指令会作为普通用户消息出现在客户端，思考过程、工具调用、回复与 token 用量会实时同步，停止按钮和 Codex 模式也与客户端是同一个。未装该插件时才回退到独立无头 agent。</w:t>
       </w:r>
     </w:p>
     <w:p>
@@ -1755,6 +1841,78 @@
           <w:sz w:val="21"/>
         </w:rPr>
         <w:t>底部「模型」下拉可切换 DeepSeek-V4.1-Flash / DeepSeek-V4-Pro，下条指令生效。</w:t>
+      </w:r>
+    </w:p>
+    <w:p>
+      <w:pPr>
+        <w:spacing w:after="80" w:line="336" w:lineRule="auto"/>
+        <w:ind w:left="510" w:hanging="312"/>
+      </w:pPr>
+      <w:r>
+        <w:rPr>
+          <w:rFonts w:ascii="微软雅黑" w:hAnsi="微软雅黑" w:eastAsia="微软雅黑"/>
+          <w:b/>
+          <w:color w:val="4D6BFE"/>
+          <w:sz w:val="21"/>
+        </w:rPr>
+        <w:t xml:space="preserve">•  </w:t>
+      </w:r>
+      <w:r>
+        <w:rPr>
+          <w:rFonts w:ascii="微软雅黑" w:hAnsi="微软雅黑" w:eastAsia="微软雅黑"/>
+          <w:b w:val="0"/>
+          <w:color w:val="2A3352"/>
+          <w:sz w:val="21"/>
+        </w:rPr>
+        <w:t>执行中，输入框右侧会出现红色停止方块；点它与在客户端点停止完全相同，会取消当前 turn。</w:t>
+      </w:r>
+    </w:p>
+    <w:p>
+      <w:pPr>
+        <w:spacing w:after="80" w:line="336" w:lineRule="auto"/>
+        <w:ind w:left="510" w:hanging="312"/>
+      </w:pPr>
+      <w:r>
+        <w:rPr>
+          <w:rFonts w:ascii="微软雅黑" w:hAnsi="微软雅黑" w:eastAsia="微软雅黑"/>
+          <w:b/>
+          <w:color w:val="4D6BFE"/>
+          <w:sz w:val="21"/>
+        </w:rPr>
+        <w:t xml:space="preserve">•  </w:t>
+      </w:r>
+      <w:r>
+        <w:rPr>
+          <w:rFonts w:ascii="微软雅黑" w:hAnsi="微软雅黑" w:eastAsia="微软雅黑"/>
+          <w:b w:val="0"/>
+          <w:color w:val="2A3352"/>
+          <w:sz w:val="21"/>
+        </w:rPr>
+        <w:t>底部 Codex 徽标显示客户端当前 Codex 状态；点它可以开关，客户端与所有会话同步。</w:t>
+      </w:r>
+    </w:p>
+    <w:p>
+      <w:pPr>
+        <w:spacing w:after="80" w:line="336" w:lineRule="auto"/>
+        <w:ind w:left="510" w:hanging="312"/>
+      </w:pPr>
+      <w:r>
+        <w:rPr>
+          <w:rFonts w:ascii="微软雅黑" w:hAnsi="微软雅黑" w:eastAsia="微软雅黑"/>
+          <w:b/>
+          <w:color w:val="4D6BFE"/>
+          <w:sz w:val="21"/>
+        </w:rPr>
+        <w:t xml:space="preserve">•  </w:t>
+      </w:r>
+      <w:r>
+        <w:rPr>
+          <w:rFonts w:ascii="微软雅黑" w:hAnsi="微软雅黑" w:eastAsia="微软雅黑"/>
+          <w:b w:val="0"/>
+          <w:color w:val="2A3352"/>
+          <w:sz w:val="21"/>
+        </w:rPr>
+        <w:t>思考过程与回复会实时逐字出现；如果客户端弹出 ask_user_question，请回客户端回答。</w:t>
       </w:r>
     </w:p>
     <w:p>
@@ -2569,7 +2727,7 @@
           <w:color w:val="2A3352"/>
           <w:sz w:val="21"/>
         </w:rPr>
-        <w:t>插件：DSH → Plugins → 移除旧插件，再按 2.3 重新安装新路径下的 dsh-plugin。</w:t>
+        <w:t>插件：DSH → Plugins → 分别移除旧插件，再按 2.3 重新安装新路径下的 dsh-plugin 与 dsh-agent-host。</w:t>
       </w:r>
     </w:p>
     <w:p>
@@ -2609,7 +2767,7 @@
           <w:color w:val="2A3352"/>
           <w:sz w:val="21"/>
         </w:rPr>
-        <w:t>DSH → Plugins → DSH Edge Bridge → Remove；再到 edge://extensions 移除扩展。</w:t>
+        <w:t>DSH → Plugins → 移除 DSH Edge Bridge 与 DSH Agent Host；再到 edge://extensions 移除扩展。</w:t>
       </w:r>
     </w:p>
     <w:p>
@@ -2741,6 +2899,22 @@
           <w:sz w:val="18"/>
         </w:rPr>
         <w:t>├── dsh-plugin/       DSH 插件（随 DSH 启动桥接）</w:t>
+      </w:r>
+    </w:p>
+    <w:p>
+      <w:pPr>
+        <w:spacing w:after="0" w:before="0" w:line="300" w:lineRule="auto"/>
+        <w:ind w:left="198"/>
+        <w:shd w:val="clear" w:color="auto" w:fill="F2F5FB"/>
+      </w:pPr>
+      <w:r>
+        <w:rPr>
+          <w:rFonts w:ascii="Consolas" w:hAnsi="Consolas" w:eastAsia="Consolas"/>
+          <w:b w:val="0"/>
+          <w:color w:val="2A3352"/>
+          <w:sz w:val="18"/>
+        </w:rPr>
+        <w:t>├── dsh-agent-host/   DSH 插件（侧边栏接客户端同一会话）</w:t>
       </w:r>
     </w:p>
     <w:p>

</xml_diff>

<commit_message>
fix: merge the live-session host into dsh-plugin; single send/stop button; drop Codex toggle
</commit_message>
<xml_diff>
--- a/安装教程.docx
+++ b/安装教程.docx
@@ -98,7 +98,7 @@
           <w:color w:val="6B7490"/>
           <w:sz w:val="21"/>
         </w:rPr>
-        <w:t>版本 1.4.0    |    2026 年 10 月</w:t>
+        <w:t>版本 1.4.1    |    2026 年 10 月</w:t>
       </w:r>
     </w:p>
     <w:p>
@@ -570,7 +570,7 @@
                 <w:b w:val="0"/>
                 <w:sz w:val="19"/>
               </w:rPr>
-              <w:t>dsh-edge-companion-1.4.0.zip</w:t>
+              <w:t>dsh-edge-companion-1.4.1.zip</w:t>
             </w:r>
           </w:p>
         </w:tc>
@@ -860,69 +860,7 @@
                 <w:b w:val="0"/>
                 <w:sz w:val="19"/>
               </w:rPr>
-              <w:t>DSH 插件：DSH 启动时自动拉起桥接</w:t>
-            </w:r>
-          </w:p>
-        </w:tc>
-        <w:tc>
-          <w:tcPr>
-            <w:tcW w:type="dxa" w:w="2041"/>
-          </w:tcPr>
-          <w:p>
-            <w:pPr>
-              <w:spacing w:after="40" w:before="20"/>
-            </w:pPr>
-            <w:r/>
-            <w:r>
-              <w:rPr>
-                <w:rFonts w:ascii="微软雅黑" w:hAnsi="微软雅黑" w:eastAsia="微软雅黑"/>
-                <w:b w:val="0"/>
-                <w:sz w:val="19"/>
-              </w:rPr>
-              <w:t>在 DSH 中安装一次</w:t>
-            </w:r>
-          </w:p>
-        </w:tc>
-      </w:tr>
-      <w:tr>
-        <w:trPr>
-          <w:cantSplit/>
-        </w:trPr>
-        <w:tc>
-          <w:tcPr>
-            <w:tcW w:type="dxa" w:w="1928"/>
-          </w:tcPr>
-          <w:p>
-            <w:pPr>
-              <w:spacing w:after="40" w:before="20"/>
-            </w:pPr>
-            <w:r/>
-            <w:r>
-              <w:rPr>
-                <w:rFonts w:ascii="微软雅黑" w:hAnsi="微软雅黑" w:eastAsia="微软雅黑"/>
-                <w:b w:val="0"/>
-                <w:sz w:val="19"/>
-              </w:rPr>
-              <w:t>dsh-agent-host/</w:t>
-            </w:r>
-          </w:p>
-        </w:tc>
-        <w:tc>
-          <w:tcPr>
-            <w:tcW w:type="dxa" w:w="5669"/>
-          </w:tcPr>
-          <w:p>
-            <w:pPr>
-              <w:spacing w:after="40" w:before="20"/>
-            </w:pPr>
-            <w:r/>
-            <w:r>
-              <w:rPr>
-                <w:rFonts w:ascii="微软雅黑" w:hAnsi="微软雅黑" w:eastAsia="微软雅黑"/>
-                <w:b w:val="0"/>
-                <w:sz w:val="19"/>
-              </w:rPr>
-              <w:t>DSH 插件：把侧边栏接到客户端同一会话（实时/停止/Codex）</w:t>
+              <w:t>DSH 插件：启动桥接，并把侧边栏接到客户端同一会话（实时/停止/Codex）</w:t>
             </w:r>
           </w:p>
         </w:tc>
@@ -1087,7 +1025,7 @@
           <w:color w:val="2A3352"/>
           <w:sz w:val="21"/>
         </w:rPr>
-        <w:t>把 dsh-edge-companion-1.4.0.zip 解压到任意目录（路径可以包含空格或中文）。</w:t>
+        <w:t>把 dsh-edge-companion-1.4.1.zip 解压到任意目录（路径可以包含空格或中文）。</w:t>
       </w:r>
     </w:p>
     <w:p>
@@ -1111,7 +1049,7 @@
           <w:color w:val="2A3352"/>
           <w:sz w:val="21"/>
         </w:rPr>
-        <w:t>建议不要放在 C:\ 根目录；解压后应能看到 extension、bridge、dsh-plugin、dsh-agent-host 等文件夹。</w:t>
+        <w:t>建议不要放在 C:\ 根目录；解压后应能看到 extension、bridge、dsh-plugin 等文件夹。</w:t>
       </w:r>
     </w:p>
     <w:p>
@@ -1223,7 +1161,7 @@
           <w:color w:val="2A3352"/>
           <w:sz w:val="21"/>
         </w:rPr>
-        <w:t>看到 DSH Edge Bridge 1.3.0（蓝发鲸鱼少女图标）即安装成功。</w:t>
+        <w:t>看到 DSH Edge Bridge 1.3.1（蓝发鲸鱼少女图标）即安装成功。</w:t>
       </w:r>
     </w:p>
     <w:p>
@@ -1253,7 +1191,7 @@
           <w:color w:val="1F2A44"/>
           <w:sz w:val="25"/>
         </w:rPr>
-        <w:t>2.3  安装两个 DSH 插件（推荐，必做）</w:t>
+        <w:t>2.3  安装 DSH 插件（推荐，必做）</w:t>
       </w:r>
     </w:p>
     <w:p>
@@ -1267,7 +1205,7 @@
           <w:color w:val="1F2A44"/>
           <w:sz w:val="21"/>
         </w:rPr>
-        <w:t>两个插件分工：dsh-plugin 负责启动桥接；dsh-agent-host 负责把侧边栏接到客户端同一个 Agent，实现实时流、停止按钮和 Codex 状态同步。</w:t>
+        <w:t>只需要安装一个 dsh-plugin：它同时负责启动桥接，并把侧边栏接到客户端同一个 Agent，实现实时流、发送键变停止键和 Codex 状态同步。</w:t>
       </w:r>
     </w:p>
     <w:p>
@@ -1363,7 +1301,7 @@
           <w:color w:val="2A3352"/>
           <w:sz w:val="21"/>
         </w:rPr>
-        <w:t>点 Install；再安装第二个文件夹 dsh-agent-host（例如 D:\tools\dsh-edge-companion\dsh-agent-host）。</w:t>
+        <w:t>点 Install（以 link: 方式安装，不联网、不下载）。</w:t>
       </w:r>
     </w:p>
     <w:p>
@@ -1387,7 +1325,7 @@
           <w:color w:val="2A3352"/>
           <w:sz w:val="21"/>
         </w:rPr>
-        <w:t>两次都以 link: 方式安装，不联网、不下载；如果提示需要重启，重启一次 DSH。</w:t>
+        <w:t>装完完全退出 DSH 再启动一次，确保旧桥接/旧宿主实例被替换。</w:t>
       </w:r>
     </w:p>
     <w:tbl>
@@ -1673,7 +1611,7 @@
           <w:color w:val="1F2A44"/>
           <w:sz w:val="21"/>
         </w:rPr>
-        <w:t>侧边栏不是另开一个聊天框：装好 dsh-agent-host 后，它直接驱动客户端当前会话——你的指令会作为普通用户消息出现在客户端，思考过程、工具调用、回复与 token 用量会实时同步，停止按钮和 Codex 模式也与客户端是同一个。未装该插件时才回退到独立无头 agent。</w:t>
+        <w:t>侧边栏不是另开一个聊天框：装好 dsh-plugin 后，它直接驱动客户端当前会话——你的指令会作为普通用户消息出现在客户端，思考过程、工具调用、回复与 token 用量会实时同步，停止按钮和 Codex 模式也与客户端是同一个。未装该插件时才回退到独立无头 agent。</w:t>
       </w:r>
     </w:p>
     <w:p>
@@ -2727,7 +2665,7 @@
           <w:color w:val="2A3352"/>
           <w:sz w:val="21"/>
         </w:rPr>
-        <w:t>插件：DSH → Plugins → 分别移除旧插件，再按 2.3 重新安装新路径下的 dsh-plugin 与 dsh-agent-host。</w:t>
+        <w:t>插件：DSH → Plugins → 移除旧插件，再按 2.3 重新安装新路径下的 dsh-plugin。</w:t>
       </w:r>
     </w:p>
     <w:p>
@@ -2898,23 +2836,7 @@
           <w:color w:val="2A3352"/>
           <w:sz w:val="18"/>
         </w:rPr>
-        <w:t>├── dsh-plugin/       DSH 插件（随 DSH 启动桥接）</w:t>
-      </w:r>
-    </w:p>
-    <w:p>
-      <w:pPr>
-        <w:spacing w:after="0" w:before="0" w:line="300" w:lineRule="auto"/>
-        <w:ind w:left="198"/>
-        <w:shd w:val="clear" w:color="auto" w:fill="F2F5FB"/>
-      </w:pPr>
-      <w:r>
-        <w:rPr>
-          <w:rFonts w:ascii="Consolas" w:hAnsi="Consolas" w:eastAsia="Consolas"/>
-          <w:b w:val="0"/>
-          <w:color w:val="2A3352"/>
-          <w:sz w:val="18"/>
-        </w:rPr>
-        <w:t>├── dsh-agent-host/   DSH 插件（侧边栏接客户端同一会话）</w:t>
+        <w:t>├── dsh-plugin/       DSH 插件（启动桥接 + 接客户端同一会话）</w:t>
       </w:r>
     </w:p>
     <w:p>

</xml_diff>

<commit_message>
feat: sync the client's real model catalog and reasoning effort to the side panel
</commit_message>
<xml_diff>
--- a/安装教程.docx
+++ b/安装教程.docx
@@ -98,7 +98,7 @@
           <w:color w:val="6B7490"/>
           <w:sz w:val="21"/>
         </w:rPr>
-        <w:t>版本 1.4.1    |    2026 年 10 月</w:t>
+        <w:t>版本 1.4.2    |    2026 年 10 月</w:t>
       </w:r>
     </w:p>
     <w:p>
@@ -570,7 +570,7 @@
                 <w:b w:val="0"/>
                 <w:sz w:val="19"/>
               </w:rPr>
-              <w:t>dsh-edge-companion-1.4.1.zip</w:t>
+              <w:t>dsh-edge-companion-1.4.2.zip</w:t>
             </w:r>
           </w:p>
         </w:tc>
@@ -1025,7 +1025,7 @@
           <w:color w:val="2A3352"/>
           <w:sz w:val="21"/>
         </w:rPr>
-        <w:t>把 dsh-edge-companion-1.4.1.zip 解压到任意目录（路径可以包含空格或中文）。</w:t>
+        <w:t>把 dsh-edge-companion-1.4.2.zip 解压到任意目录（路径可以包含空格或中文）。</w:t>
       </w:r>
     </w:p>
     <w:p>
@@ -1161,7 +1161,7 @@
           <w:color w:val="2A3352"/>
           <w:sz w:val="21"/>
         </w:rPr>
-        <w:t>看到 DSH Edge Bridge 1.3.1（蓝发鲸鱼少女图标）即安装成功。</w:t>
+        <w:t>看到 DSH Edge Bridge 1.3.2（蓝发鲸鱼少女图标）即安装成功。</w:t>
       </w:r>
     </w:p>
     <w:p>

</xml_diff>

<commit_message>
style: neumorphic model picker; bump extension 1.3.3 / package 1.4.3
</commit_message>
<xml_diff>
--- a/安装教程.docx
+++ b/安装教程.docx
@@ -98,7 +98,7 @@
           <w:color w:val="6B7490"/>
           <w:sz w:val="21"/>
         </w:rPr>
-        <w:t>版本 1.4.2    |    2026 年 10 月</w:t>
+        <w:t>版本 1.4.3    |    2026 年 10 月</w:t>
       </w:r>
     </w:p>
     <w:p>
@@ -570,7 +570,7 @@
                 <w:b w:val="0"/>
                 <w:sz w:val="19"/>
               </w:rPr>
-              <w:t>dsh-edge-companion-1.4.2.zip</w:t>
+              <w:t>dsh-edge-companion-1.4.3.zip</w:t>
             </w:r>
           </w:p>
         </w:tc>
@@ -1025,7 +1025,7 @@
           <w:color w:val="2A3352"/>
           <w:sz w:val="21"/>
         </w:rPr>
-        <w:t>把 dsh-edge-companion-1.4.2.zip 解压到任意目录（路径可以包含空格或中文）。</w:t>
+        <w:t>把 dsh-edge-companion-1.4.3.zip 解压到任意目录（路径可以包含空格或中文）。</w:t>
       </w:r>
     </w:p>
     <w:p>
@@ -1161,7 +1161,7 @@
           <w:color w:val="2A3352"/>
           <w:sz w:val="21"/>
         </w:rPr>
-        <w:t>看到 DSH Edge Bridge 1.3.2（蓝发鲸鱼少女图标）即安装成功。</w:t>
+        <w:t>看到 DSH Edge Bridge 1.3.3（蓝发鲸鱼少女图标）即安装成功。</w:t>
       </w:r>
     </w:p>
     <w:p>

</xml_diff>